<commit_message>
docs: interpretar ROC-AUC y Brier score en negocio (Informe + Presentación)
Cierra los gaps de traducción a negocio detectados en el Informe Técnico y la
Presentación de Defensa: ROC-AUC y Brier score ahora tienen interpretación de
negocio (mismo tratamiento que ya tenía PR-AUC), citando las cifras exactas de
model_card.json (0.6308 / 0.0317) sin alterar ningún resultado del modelado.

Incluye el flujo spec-kit completo (spec, plan, research, data-model,
quickstart, tasks) en specs/001-informe-metricas-negocio/.

Co-Authored-By: Claude Sonnet 5 <noreply@anthropic.com>
</commit_message>
<xml_diff>
--- a/docs/Informe_Tecnico_ShopMart_Olist.docx
+++ b/docs/Informe_Tecnico_ShopMart_Olist.docx
@@ -995,6 +995,18 @@
           <w:i w:val="0"/>
         </w:rPr>
         <w:t>El modelo mejora de forma consistente sobre el baseline en PR-AUC (0.059 vs. 0.033 de tasa base), pero el valor absoluto es modesto y confirma la hipótesis del EDA: la recompra depende de factores no observados en el dataset (competencia, necesidad real del producto, campañas externas). Traducido a negocio: contactar al 10% de clientes con mayor score produce una tasa de recompra observada 2.27 veces superior a un contacto aleatorio — un lift moderado pero accionable para focalizar presupuesto de marketing/CRM. El análisis de permutation importance (figura 6) muestra que las variables más influyentes coinciden con las señales identificadas en el EDA (valor del pedido, cuotas de pago, flete, tiempos de entrega y algunas categorías de producto), dando consistencia narrativa entre el análisis exploratorio y el modelo final. Es relevante que ninguna categoría de customer_state figura entre esas 15 variables (de 70 columnas transformadas): la decisión de alcance de no integrar la tabla de geolocalización (sección 1.4) no limitó el desempeño del modelo, ya que la variación geográfica —incluso a nivel de estado— no resultó ser una señal relevante para la recompra. El análisis de errores por subgrupo (categoría de producto, customer_state) no reveló degradaciones sistemáticas de desempeño, aunque el volumen por subgrupo es limitado y estas estimaciones deben tratarse como orientativas (ver sección 4.1).</w:t>
+      </w:r>
+    </w:p>
+    <w:p>
+      <w:pPr/>
+      <w:r>
+        <w:t>En términos de ROC-AUC, el modelo alcanza 0.6308 en test: si se toma al azar un cliente que sí recompró y uno que no, el modelo le asigna mayor score al que sí recompró en el 63% de esas comparaciones (0.50 equivale a un ordenamiento puramente al azar, 1.00 a un orden perfecto). Es una mejora clara pero moderada sobre el azar, consistente con la señal predictiva modesta ya señalada para PR-AUC.</w:t>
+      </w:r>
+    </w:p>
+    <w:p>
+      <w:pPr/>
+      <w:r>
+        <w:t>El Brier score de test (0.0317) mide qué tan cerca están, en promedio, las probabilidades predichas por el modelo del resultado real (0 = probabilidades perfectas). Esta cifra debe leerse con cautela: como solo ~3.3% de los clientes recompra, un modelo que no aprendiera nada y predijera siempre la tasa base ya obtendría un Brier score bajo, así que el valor por sí solo no certifica un buen desempeño — debe interpretarse junto con el PR-AUC y el lift ya reportados, no de forma aislada.</w:t>
       </w:r>
     </w:p>
     <w:p>

</xml_diff>

<commit_message>
fix: auditar desempeño por customer_state y corregir cifra de iteraciones del modelo
NB2 §5.2 ahora calcula el desempeño real por customer_state (antes solo se
afirmaba sin evidencia en el Informe/Presentación); model_card.json persiste
n_iter_actual (62 rondas de boosting reales, vs. el techo max_iter=150 del
espacio de búsqueda que se citaba por error). Informe Técnico y Presentación
actualizados para reportar ambos hallazgos reales, con la salvedad de los
estados sin casos positivos en test. Ninguna métrica global (PR-AUC/ROC-AUC/
Brier/lift) cambió al re-ejecutar NB2.

Co-Authored-By: Claude Sonnet 5 <noreply@anthropic.com>
</commit_message>
<xml_diff>
--- a/docs/Informe_Tecnico_ShopMart_Olist.docx
+++ b/docs/Informe_Tecnico_ShopMart_Olist.docx
@@ -994,7 +994,7 @@
           <w:b w:val="0"/>
           <w:i w:val="0"/>
         </w:rPr>
-        <w:t>El modelo mejora de forma consistente sobre el baseline en PR-AUC (0.059 vs. 0.033 de tasa base), pero el valor absoluto es modesto y confirma la hipótesis del EDA: la recompra depende de factores no observados en el dataset (competencia, necesidad real del producto, campañas externas). Traducido a negocio: contactar al 10% de clientes con mayor score produce una tasa de recompra observada 2.27 veces superior a un contacto aleatorio — un lift moderado pero accionable para focalizar presupuesto de marketing/CRM. El análisis de permutation importance (figura 6) muestra que las variables más influyentes coinciden con las señales identificadas en el EDA (valor del pedido, cuotas de pago, flete, tiempos de entrega y algunas categorías de producto), dando consistencia narrativa entre el análisis exploratorio y el modelo final. Es relevante que ninguna categoría de customer_state figura entre esas 15 variables (de 70 columnas transformadas): la decisión de alcance de no integrar la tabla de geolocalización (sección 1.4) no limitó el desempeño del modelo, ya que la variación geográfica —incluso a nivel de estado— no resultó ser una señal relevante para la recompra. El análisis de errores por subgrupo (categoría de producto, customer_state) no reveló degradaciones sistemáticas de desempeño, aunque el volumen por subgrupo es limitado y estas estimaciones deben tratarse como orientativas (ver sección 4.1).</w:t>
+        <w:t>El modelo mejora de forma consistente sobre el baseline en PR-AUC (0.059 vs. 0.033 de tasa base), pero el valor absoluto es modesto y confirma la hipótesis del EDA: la recompra depende de factores no observados en el dataset (competencia, necesidad real del producto, campañas externas). Traducido a negocio: contactar al 10% de clientes con mayor score produce una tasa de recompra observada 2.27 veces superior a un contacto aleatorio — un lift moderado pero accionable para focalizar presupuesto de marketing/CRM. El análisis de permutation importance (figura 6) muestra que las variables más influyentes coinciden con las señales identificadas en el EDA (valor del pedido, cuotas de pago, flete, tiempos de entrega y algunas categorías de producto), dando consistencia narrativa entre el análisis exploratorio y el modelo final. Es relevante que ninguna categoría de customer_state figura entre esas 15 variables (de 70 columnas transformadas): la decisión de alcance de no integrar la tabla de geolocalización (sección 1.4) no limitó el desempeño del modelo, ya que la variación geográfica —incluso a nivel de estado— no resultó ser una señal relevante para la recompra. El análisis de errores por subgrupo (sección 4.1) muestra: por categoría de producto, ninguna degradación sistemática de desempeño; por customer_state (27 estados), el PR-AUC varía entre 0.025 y 0.208 para los 24 estados con al menos un cliente que recompró en test —sin un patrón geográfico evidente—, mientras que 3 estados (SE, AM, RR) no tuvieron ningún caso de recompra en test y quedan sin evaluar; el volumen por subgrupo es limitado en ambos ejes y estas estimaciones deben tratarse como orientativas.</w:t>
       </w:r>
     </w:p>
     <w:p>
@@ -1076,7 +1076,7 @@
           <w:b w:val="0"/>
           <w:i w:val="0"/>
         </w:rPr>
-        <w:t>Se implementó una función mínima de inferencia (predict_one) que recibe las features crudas de un primer pedido, aplica el preprocessor.joblib persistido y devuelve la probabilidad de recompra y la decisión bajo el umbral calibrado — lista para envolverse en un endpoint de API (p. ej. FastAPI). El modelo es liviano (HistGradientBoostingClassifier con 150 iteraciones) y su latencia de inferencia es del orden de milisegundos por registro, compatible con un endpoint síncrono. Para un despliegue real se recomienda: reentrenamiento periódico (p. ej. trimestral, dado el carácter estático del dataset de entrenamiento), monitoreo de data drift en las variables de mayor importancia, versionado del model_card.json junto con cada despliegue, y supervisión humana antes de excluir clientes de campañas basándose únicamente en el score.</w:t>
+        <w:t>Se implementó una función mínima de inferencia (predict_one) que recibe las features crudas de un primer pedido, aplica el preprocessor.joblib persistido y devuelve la probabilidad de recompra y la decisión bajo el umbral calibrado — lista para envolverse en un endpoint de API (p. ej. FastAPI). El modelo es liviano (HistGradientBoostingClassifier con 62 rondas de boosting realmente entrenadas, por debajo del techo de 150 buscado en la optimización de hiperparámetros, gracias al early stopping automático de scikit-learn) y su latencia de inferencia es del orden de milisegundos por registro, compatible con un endpoint síncrono. Para un despliegue real se recomienda: reentrenamiento periódico (p. ej. trimestral, dado el carácter estático del dataset de entrenamiento), monitoreo de data drift en las variables de mayor importancia, versionado del model_card.json junto con cada despliegue, y supervisión humana antes de excluir clientes de campañas basándose únicamente en el score.</w:t>
       </w:r>
     </w:p>
     <w:p>
@@ -1112,7 +1112,7 @@
           <w:b w:val="0"/>
           <w:i w:val="0"/>
         </w:rPr>
-        <w:t>customer_state se usa únicamente como feature predictiva, nunca como criterio de exclusión de campañas, para evitar decisiones discriminatorias por geografía. El desempeño del modelo por categoría de producto y por estado no mostró disparidades sistemáticas severas, aunque el tamaño muestral por subgrupo es limitado y se recomienda monitorear esta métrica si el modelo se pusiera en producción. En la segmentación RFM se usaron etiquetas de negocio neutrales (p. ej. "en_riesgo_bajo_valor", "premium_recientes") derivadas de las características de comportamiento real de cada segmento (recencia y frecuencia), evitando etiquetas cargadas de valor o estigmatizantes.</w:t>
+        <w:t>customer_state se usa únicamente como feature predictiva, nunca como criterio de exclusión de campañas, para evitar decisiones discriminatorias por geografía. El desempeño del modelo se audita explícitamente por categoría de producto y por customer_state (ver sección 3.4): no se observa una disparidad sistemática severa entre los estados con volumen suficiente para ser confiables (PR-AUC entre 0.025 y 0.208 en 24 de 27 estados), aunque 3 estados no tuvieron ningún caso positivo en test y quedan sin evaluar, y se recomienda monitorear esta métrica con más datos si el modelo se pusiera en producción. En la segmentación RFM se usaron etiquetas de negocio neutrales (p. ej. "en_riesgo_bajo_valor", "premium_recientes") derivadas de las características de comportamiento real de cada segmento (recencia y frecuencia), evitando etiquetas cargadas de valor o estigmatizantes.</w:t>
       </w:r>
     </w:p>
     <w:p>

</xml_diff>